<commit_message>
Update MADGI ESR user guide
</commit_message>
<xml_diff>
--- a/output/Guide_utilisateur_MADGI_ESR.docx
+++ b/output/Guide_utilisateur_MADGI_ESR.docx
@@ -1620,7 +1620,7 @@
         <w:spacing w:after="120"/>
       </w:pPr>
       <w:r>
-        <w:t xml:space="preserve">Le tableau de bord est le premier écran visible après connexion pour un gestionnaire ou un administrateur. Il donne une vue synthétique de l'activité.</w:t>
+        <w:t xml:space="preserve">Le tableau de bord est le premier écran visible après connexion pour un gestionnaire ou un administrateur. Il donne une vue synthétique et filtrable de l'activité, par trimestre ou par année.</w:t>
       </w:r>
     </w:p>
     <w:p>
@@ -1629,7 +1629,92 @@
         <w:spacing w:after="120" w:before="280"/>
       </w:pPr>
       <w:r>
-        <w:t xml:space="preserve">4.1 Indicateurs clés</w:t>
+        <w:t xml:space="preserve">4.1 Choisir la période analysée</w:t>
+      </w:r>
+    </w:p>
+    <w:p>
+      <w:pPr>
+        <w:spacing w:after="90"/>
+        <w:ind w:left="200"/>
+      </w:pPr>
+      <w:r>
+        <w:rPr>
+          <w:b/>
+          <w:bCs/>
+          <w:color w:val="2B529F"/>
+        </w:rPr>
+        <w:t xml:space="preserve">1. </w:t>
+      </w:r>
+      <w:r>
+        <w:t xml:space="preserve">Choisir le mode d’affichage : « Par trimestre » ou « Par année ».</w:t>
+      </w:r>
+    </w:p>
+    <w:p>
+      <w:pPr>
+        <w:spacing w:after="90"/>
+        <w:ind w:left="200"/>
+      </w:pPr>
+      <w:r>
+        <w:rPr>
+          <w:b/>
+          <w:bCs/>
+          <w:color w:val="2B529F"/>
+        </w:rPr>
+        <w:t xml:space="preserve">2. </w:t>
+      </w:r>
+      <w:r>
+        <w:t xml:space="preserve">Sélectionner l’« Année » (les six derniers exercices sont proposés).</w:t>
+      </w:r>
+    </w:p>
+    <w:p>
+      <w:pPr>
+        <w:spacing w:after="90"/>
+        <w:ind w:left="200"/>
+      </w:pPr>
+      <w:r>
+        <w:rPr>
+          <w:b/>
+          <w:bCs/>
+          <w:color w:val="2B529F"/>
+        </w:rPr>
+        <w:t xml:space="preserve">3. </w:t>
+      </w:r>
+      <w:r>
+        <w:t xml:space="preserve">En mode « Par trimestre », sélectionner en plus le « Trimestre » (T1 à T4).</w:t>
+      </w:r>
+    </w:p>
+    <w:p>
+      <w:pPr>
+        <w:spacing w:after="90"/>
+        <w:ind w:left="200"/>
+      </w:pPr>
+      <w:r>
+        <w:rPr>
+          <w:b/>
+          <w:bCs/>
+          <w:color w:val="2B529F"/>
+        </w:rPr>
+        <w:t xml:space="preserve">4. </w:t>
+      </w:r>
+      <w:r>
+        <w:t xml:space="preserve">Cliquer sur « Actualiser » pour recharger les données selon la période choisie.</w:t>
+      </w:r>
+    </w:p>
+    <w:p>
+      <w:pPr>
+        <w:spacing w:after="120"/>
+      </w:pPr>
+      <w:r>
+        <w:t xml:space="preserve">La bannière d'en-tête rappelle en permanence la « Période analysée » ainsi que la date, l'heure de dernière actualisation et le matricule de l'utilisateur connecté.</w:t>
+      </w:r>
+    </w:p>
+    <w:p>
+      <w:pPr>
+        <w:pStyle w:val="Heading2"/>
+        <w:spacing w:after="120" w:before="280"/>
+      </w:pPr>
+      <w:r>
+        <w:t xml:space="preserve">4.2 Indicateurs clés</w:t>
       </w:r>
     </w:p>
     <w:tbl>
@@ -1646,7 +1731,8 @@
       </w:tblPr>
       <w:tblGrid>
         <w:gridCol w:w="2600"/>
-        <w:gridCol w:w="6700"/>
+        <w:gridCol w:w="3200"/>
+        <w:gridCol w:w="3500"/>
       </w:tblGrid>
       <w:tr>
         <w:trPr>
@@ -1679,7 +1765,7 @@
         </w:tc>
         <w:tc>
           <w:tcPr>
-            <w:tcW w:type="dxa" w:w="6700"/>
+            <w:tcW w:type="dxa" w:w="3200"/>
             <w:shd w:fill="2B529F" w:val="clear"/>
             <w:tcMar>
               <w:top w:type="dxa" w:w="100"/>
@@ -1698,7 +1784,32 @@
                 <w:sz w:val="19"/>
                 <w:szCs w:val="19"/>
               </w:rPr>
-              <w:t xml:space="preserve">Signification</w:t>
+              <w:t xml:space="preserve">Valeur affichée</w:t>
+            </w:r>
+          </w:p>
+        </w:tc>
+        <w:tc>
+          <w:tcPr>
+            <w:tcW w:type="dxa" w:w="3500"/>
+            <w:shd w:fill="2B529F" w:val="clear"/>
+            <w:tcMar>
+              <w:top w:type="dxa" w:w="100"/>
+              <w:left w:type="dxa" w:w="120"/>
+              <w:bottom w:type="dxa" w:w="100"/>
+              <w:right w:type="dxa" w:w="120"/>
+            </w:tcMar>
+            <w:vAlign w:val="center"/>
+          </w:tcPr>
+          <w:p>
+            <w:r>
+              <w:rPr>
+                <w:b/>
+                <w:bCs/>
+                <w:color w:val="FFFFFF"/>
+                <w:sz w:val="19"/>
+                <w:szCs w:val="19"/>
+              </w:rPr>
+              <w:t xml:space="preserve">Détail affiché en dessous</w:t>
             </w:r>
           </w:p>
         </w:tc>
@@ -1729,24 +1840,47 @@
         </w:tc>
         <w:tc>
           <w:tcPr>
-            <w:tcW w:type="dxa" w:w="6700"/>
-            <w:tcMar>
-              <w:top w:type="dxa" w:w="100"/>
-              <w:left w:type="dxa" w:w="120"/>
-              <w:bottom w:type="dxa" w:w="100"/>
-              <w:right w:type="dxa" w:w="120"/>
-            </w:tcMar>
-            <w:vAlign w:val="center"/>
-          </w:tcPr>
-          <w:p>
-            <w:r>
-              <w:rPr>
-                <w:b w:val="false"/>
-                <w:bCs w:val="false"/>
-                <w:sz w:val="19"/>
-                <w:szCs w:val="19"/>
-              </w:rPr>
-              <w:t xml:space="preserve">Nombre total d'adhérents au statut ACTIF.</w:t>
+            <w:tcW w:type="dxa" w:w="3200"/>
+            <w:tcMar>
+              <w:top w:type="dxa" w:w="100"/>
+              <w:left w:type="dxa" w:w="120"/>
+              <w:bottom w:type="dxa" w:w="100"/>
+              <w:right w:type="dxa" w:w="120"/>
+            </w:tcMar>
+            <w:vAlign w:val="center"/>
+          </w:tcPr>
+          <w:p>
+            <w:r>
+              <w:rPr>
+                <w:b w:val="false"/>
+                <w:bCs w:val="false"/>
+                <w:sz w:val="19"/>
+                <w:szCs w:val="19"/>
+              </w:rPr>
+              <w:t xml:space="preserve">Nombre d’adhérents au statut ACTIF</w:t>
+            </w:r>
+          </w:p>
+        </w:tc>
+        <w:tc>
+          <w:tcPr>
+            <w:tcW w:type="dxa" w:w="3500"/>
+            <w:tcMar>
+              <w:top w:type="dxa" w:w="100"/>
+              <w:left w:type="dxa" w:w="120"/>
+              <w:bottom w:type="dxa" w:w="100"/>
+              <w:right w:type="dxa" w:w="120"/>
+            </w:tcMar>
+            <w:vAlign w:val="center"/>
+          </w:tcPr>
+          <w:p>
+            <w:r>
+              <w:rPr>
+                <w:b w:val="false"/>
+                <w:bCs w:val="false"/>
+                <w:sz w:val="19"/>
+                <w:szCs w:val="19"/>
+              </w:rPr>
+              <w:t xml:space="preserve">« {X} adhérents au total »</w:t>
             </w:r>
           </w:p>
         </w:tc>
@@ -1772,13 +1906,13 @@
                 <w:sz w:val="19"/>
                 <w:szCs w:val="19"/>
               </w:rPr>
-              <w:t xml:space="preserve">Cotisation trimestrielle</w:t>
-            </w:r>
-          </w:p>
-        </w:tc>
-        <w:tc>
-          <w:tcPr>
-            <w:tcW w:type="dxa" w:w="6700"/>
+              <w:t xml:space="preserve">Cotisations attendues</w:t>
+            </w:r>
+          </w:p>
+        </w:tc>
+        <w:tc>
+          <w:tcPr>
+            <w:tcW w:type="dxa" w:w="3200"/>
             <w:shd w:fill="F2F5FA" w:val="clear"/>
             <w:tcMar>
               <w:top w:type="dxa" w:w="100"/>
@@ -1796,7 +1930,31 @@
                 <w:sz w:val="19"/>
                 <w:szCs w:val="19"/>
               </w:rPr>
-              <w:t xml:space="preserve">Montant total attendu sur le trimestre en cours (F CFA).</w:t>
+              <w:t xml:space="preserve">Montant prévu sur la période choisie (F CFA)</w:t>
+            </w:r>
+          </w:p>
+        </w:tc>
+        <w:tc>
+          <w:tcPr>
+            <w:tcW w:type="dxa" w:w="3500"/>
+            <w:shd w:fill="F2F5FA" w:val="clear"/>
+            <w:tcMar>
+              <w:top w:type="dxa" w:w="100"/>
+              <w:left w:type="dxa" w:w="120"/>
+              <w:bottom w:type="dxa" w:w="100"/>
+              <w:right w:type="dxa" w:w="120"/>
+            </w:tcMar>
+            <w:vAlign w:val="center"/>
+          </w:tcPr>
+          <w:p>
+            <w:r>
+              <w:rPr>
+                <w:b w:val="false"/>
+                <w:bCs w:val="false"/>
+                <w:sz w:val="19"/>
+                <w:szCs w:val="19"/>
+              </w:rPr>
+              <w:t xml:space="preserve">Libellé de la période (ex. 2026T3)</w:t>
             </w:r>
           </w:p>
         </w:tc>
@@ -1821,30 +1979,53 @@
                 <w:sz w:val="19"/>
                 <w:szCs w:val="19"/>
               </w:rPr>
-              <w:t xml:space="preserve">Prestation</w:t>
-            </w:r>
-          </w:p>
-        </w:tc>
-        <w:tc>
-          <w:tcPr>
-            <w:tcW w:type="dxa" w:w="6700"/>
-            <w:tcMar>
-              <w:top w:type="dxa" w:w="100"/>
-              <w:left w:type="dxa" w:w="120"/>
-              <w:bottom w:type="dxa" w:w="100"/>
-              <w:right w:type="dxa" w:w="120"/>
-            </w:tcMar>
-            <w:vAlign w:val="center"/>
-          </w:tcPr>
-          <w:p>
-            <w:r>
-              <w:rPr>
-                <w:b w:val="false"/>
-                <w:bCs w:val="false"/>
-                <w:sz w:val="19"/>
-                <w:szCs w:val="19"/>
-              </w:rPr>
-              <w:t xml:space="preserve">Nombre de dossiers de prestations en cours.</w:t>
+              <w:t xml:space="preserve">Cotisations encaissées</w:t>
+            </w:r>
+          </w:p>
+        </w:tc>
+        <w:tc>
+          <w:tcPr>
+            <w:tcW w:type="dxa" w:w="3200"/>
+            <w:tcMar>
+              <w:top w:type="dxa" w:w="100"/>
+              <w:left w:type="dxa" w:w="120"/>
+              <w:bottom w:type="dxa" w:w="100"/>
+              <w:right w:type="dxa" w:w="120"/>
+            </w:tcMar>
+            <w:vAlign w:val="center"/>
+          </w:tcPr>
+          <w:p>
+            <w:r>
+              <w:rPr>
+                <w:b w:val="false"/>
+                <w:bCs w:val="false"/>
+                <w:sz w:val="19"/>
+                <w:szCs w:val="19"/>
+              </w:rPr>
+              <w:t xml:space="preserve">Montant réellement encaissé sur la période (F CFA)</w:t>
+            </w:r>
+          </w:p>
+        </w:tc>
+        <w:tc>
+          <w:tcPr>
+            <w:tcW w:type="dxa" w:w="3500"/>
+            <w:tcMar>
+              <w:top w:type="dxa" w:w="100"/>
+              <w:left w:type="dxa" w:w="120"/>
+              <w:bottom w:type="dxa" w:w="100"/>
+              <w:right w:type="dxa" w:w="120"/>
+            </w:tcMar>
+            <w:vAlign w:val="center"/>
+          </w:tcPr>
+          <w:p>
+            <w:r>
+              <w:rPr>
+                <w:b w:val="false"/>
+                <w:bCs w:val="false"/>
+                <w:sz w:val="19"/>
+                <w:szCs w:val="19"/>
+              </w:rPr>
+              <w:t xml:space="preserve">« {X} mouvement(s) »</w:t>
             </w:r>
           </w:p>
         </w:tc>
@@ -1870,13 +2051,13 @@
                 <w:sz w:val="19"/>
                 <w:szCs w:val="19"/>
               </w:rPr>
-              <w:t xml:space="preserve">Provision totale</w:t>
-            </w:r>
-          </w:p>
-        </w:tc>
-        <w:tc>
-          <w:tcPr>
-            <w:tcW w:type="dxa" w:w="6700"/>
+              <w:t xml:space="preserve">Taux de recouvrement</w:t>
+            </w:r>
+          </w:p>
+        </w:tc>
+        <w:tc>
+          <w:tcPr>
+            <w:tcW w:type="dxa" w:w="3200"/>
             <w:shd w:fill="F2F5FA" w:val="clear"/>
             <w:tcMar>
               <w:top w:type="dxa" w:w="100"/>
@@ -1894,7 +2075,102 @@
                 <w:sz w:val="19"/>
                 <w:szCs w:val="19"/>
               </w:rPr>
-              <w:t xml:space="preserve">Somme des provisions mathématiques de tous les comptes ESR (F CFA).</w:t>
+              <w:t xml:space="preserve">Pourcentage encaissé / attendu</w:t>
+            </w:r>
+          </w:p>
+        </w:tc>
+        <w:tc>
+          <w:tcPr>
+            <w:tcW w:type="dxa" w:w="3500"/>
+            <w:shd w:fill="F2F5FA" w:val="clear"/>
+            <w:tcMar>
+              <w:top w:type="dxa" w:w="100"/>
+              <w:left w:type="dxa" w:w="120"/>
+              <w:bottom w:type="dxa" w:w="100"/>
+              <w:right w:type="dxa" w:w="120"/>
+            </w:tcMar>
+            <w:vAlign w:val="center"/>
+          </w:tcPr>
+          <w:p>
+            <w:r>
+              <w:rPr>
+                <w:b w:val="false"/>
+                <w:bCs w:val="false"/>
+                <w:sz w:val="19"/>
+                <w:szCs w:val="19"/>
+              </w:rPr>
+              <w:t xml:space="preserve">« Écart : {montant} » — vert à partir de 90 %, orange en dessous</w:t>
+            </w:r>
+          </w:p>
+        </w:tc>
+      </w:tr>
+      <w:tr>
+        <w:tc>
+          <w:tcPr>
+            <w:tcW w:type="dxa" w:w="2600"/>
+            <w:tcMar>
+              <w:top w:type="dxa" w:w="100"/>
+              <w:left w:type="dxa" w:w="120"/>
+              <w:bottom w:type="dxa" w:w="100"/>
+              <w:right w:type="dxa" w:w="120"/>
+            </w:tcMar>
+            <w:vAlign w:val="center"/>
+          </w:tcPr>
+          <w:p>
+            <w:r>
+              <w:rPr>
+                <w:b w:val="false"/>
+                <w:bCs w:val="false"/>
+                <w:sz w:val="19"/>
+                <w:szCs w:val="19"/>
+              </w:rPr>
+              <w:t xml:space="preserve">Provision mathématique</w:t>
+            </w:r>
+          </w:p>
+        </w:tc>
+        <w:tc>
+          <w:tcPr>
+            <w:tcW w:type="dxa" w:w="3200"/>
+            <w:tcMar>
+              <w:top w:type="dxa" w:w="100"/>
+              <w:left w:type="dxa" w:w="120"/>
+              <w:bottom w:type="dxa" w:w="100"/>
+              <w:right w:type="dxa" w:w="120"/>
+            </w:tcMar>
+            <w:vAlign w:val="center"/>
+          </w:tcPr>
+          <w:p>
+            <w:r>
+              <w:rPr>
+                <w:b w:val="false"/>
+                <w:bCs w:val="false"/>
+                <w:sz w:val="19"/>
+                <w:szCs w:val="19"/>
+              </w:rPr>
+              <w:t xml:space="preserve">Dernière provision mathématique totale calculée (F CFA)</w:t>
+            </w:r>
+          </w:p>
+        </w:tc>
+        <w:tc>
+          <w:tcPr>
+            <w:tcW w:type="dxa" w:w="3500"/>
+            <w:tcMar>
+              <w:top w:type="dxa" w:w="100"/>
+              <w:left w:type="dxa" w:w="120"/>
+              <w:bottom w:type="dxa" w:w="100"/>
+              <w:right w:type="dxa" w:w="120"/>
+            </w:tcMar>
+            <w:vAlign w:val="center"/>
+          </w:tcPr>
+          <w:p>
+            <w:r>
+              <w:rPr>
+                <w:b w:val="false"/>
+                <w:bCs w:val="false"/>
+                <w:sz w:val="19"/>
+                <w:szCs w:val="19"/>
+              </w:rPr>
+              <w:t xml:space="preserve">« Dernier calcul disponible »</w:t>
             </w:r>
           </w:p>
         </w:tc>
@@ -1911,7 +2187,32 @@
         <w:spacing w:after="120" w:before="280"/>
       </w:pPr>
       <w:r>
-        <w:t xml:space="preserve">4.2 Graphiques</w:t>
+        <w:t xml:space="preserve">4.3 Cotisations attendues et encaissées</w:t>
+      </w:r>
+    </w:p>
+    <w:p>
+      <w:pPr>
+        <w:spacing w:after="120"/>
+      </w:pPr>
+      <w:r>
+        <w:t xml:space="preserve">Ce panneau compare, trimestre par trimestre sur l'exercice sélectionné, le montant encaissé au montant prévu, sous forme de barres de progression. En mode « Par trimestre », les trimestres non sélectionnés apparaissent estompés pour mettre en évidence la période choisie.</w:t>
+      </w:r>
+    </w:p>
+    <w:p>
+      <w:pPr>
+        <w:pStyle w:val="Heading2"/>
+        <w:spacing w:after="120" w:before="280"/>
+      </w:pPr>
+      <w:r>
+        <w:t xml:space="preserve">4.4 Actions requises</w:t>
+      </w:r>
+    </w:p>
+    <w:p>
+      <w:pPr>
+        <w:spacing w:after="120"/>
+      </w:pPr>
+      <w:r>
+        <w:t xml:space="preserve">Ce panneau signale, avec une icône orange (à traiter) ou verte (rien à signaler), trois points de vigilance :</w:t>
       </w:r>
     </w:p>
     <w:p>
@@ -1924,7 +2225,7 @@
         <w:spacing w:after="80"/>
       </w:pPr>
       <w:r>
-        <w:t xml:space="preserve">« Capital acquis / Provision mathématiques » — comparaison en barres.</w:t>
+        <w:t xml:space="preserve">« Écart de cotisations » — montant restant à rapprocher sur la période.</w:t>
       </w:r>
     </w:p>
     <w:p>
@@ -1937,16 +2238,7 @@
         <w:spacing w:after="80"/>
       </w:pPr>
       <w:r>
-        <w:t xml:space="preserve">« Répartition des adhérents » — donut affichant la part des adhérents ACTIF.</w:t>
-      </w:r>
-    </w:p>
-    <w:p>
-      <w:pPr>
-        <w:pStyle w:val="Heading2"/>
-        <w:spacing w:after="120" w:before="280"/>
-      </w:pPr>
-      <w:r>
-        <w:t xml:space="preserve">4.3 Listes récentes</w:t>
+        <w:t xml:space="preserve">« Adhésions à valider » — nombre de demandes d’adhésion en ligne en attente de validation (voir chapitre 6).</w:t>
       </w:r>
     </w:p>
     <w:p>
@@ -1959,20 +2251,16 @@
         <w:spacing w:after="80"/>
       </w:pPr>
       <w:r>
-        <w:t xml:space="preserve">« Dernières cotisations » : Date, Montant, Adhérent, Source.</w:t>
-      </w:r>
-    </w:p>
-    <w:p>
-      <w:pPr>
-        <w:pStyle w:val="ListParagraph"/>
-        <w:numPr>
-          <w:ilvl w:val="0"/>
-          <w:numId w:val="1"/>
-        </w:numPr>
-        <w:spacing w:after="80"/>
-      </w:pPr>
-      <w:r>
-        <w:t xml:space="preserve">« Dernières prestations » : Date, Adhérent, Type, Statut.</w:t>
+        <w:t xml:space="preserve">« Prestations » — nombre de dossiers de prestations enregistrés.</w:t>
+      </w:r>
+    </w:p>
+    <w:p>
+      <w:pPr>
+        <w:pStyle w:val="Heading2"/>
+        <w:spacing w:after="120" w:before="280"/>
+      </w:pPr>
+      <w:r>
+        <w:t xml:space="preserve">4.5 Répartition des adhérents</w:t>
       </w:r>
     </w:p>
     <w:p>
@@ -1980,7 +2268,24 @@
         <w:spacing w:after="120"/>
       </w:pPr>
       <w:r>
-        <w:t xml:space="preserve">Le bouton « Actualiser » recharge l’ensemble des données du tableau de bord.</w:t>
+        <w:t xml:space="preserve">Quatre compteurs : Actifs, Retraités, Décédés, Adhésions en ligne en attente de validation.</w:t>
+      </w:r>
+    </w:p>
+    <w:p>
+      <w:pPr>
+        <w:pStyle w:val="Heading2"/>
+        <w:spacing w:after="120" w:before="280"/>
+      </w:pPr>
+      <w:r>
+        <w:t xml:space="preserve">4.6 Dernières cotisations de la période</w:t>
+      </w:r>
+    </w:p>
+    <w:p>
+      <w:pPr>
+        <w:spacing w:after="120"/>
+      </w:pPr>
+      <w:r>
+        <w:t xml:space="preserve">Liste des cotisations les plus récentes enregistrées sur la période sélectionnée (jusqu'à 5), avec pour chacune l'adhérent, la date, la source (Précompte, Cotisation spontanée, Régularisation de précompte, Versement direct) et le montant.</w:t>
       </w:r>
     </w:p>
     <w:p>

</xml_diff>